<commit_message>
Complete final report and documentation
</commit_message>
<xml_diff>
--- a/docs/CSCE4890_Final_Report.docx
+++ b/docs/CSCE4890_Final_Report.docx
@@ -5443,188 +5443,307 @@
     <w:p>
       <w:pPr>
         <w:spacing w:before="240" w:beforeAutospacing="off" w:after="240" w:afterAutospacing="off" w:line="480" w:lineRule="auto"/>
-      </w:pPr>
-      <w:r>
-        <w:rPr>
-          <w:rFonts w:ascii="Times New Roman" w:hAnsi="Times New Roman" w:eastAsia="Times New Roman" w:cs="Times New Roman"/>
-          <w:noProof w:val="0"/>
-          <w:sz w:val="24"/>
-          <w:szCs w:val="24"/>
-          <w:lang w:val="en-US"/>
+        <w:rPr>
+          <w:rFonts w:ascii="Times New Roman" w:hAnsi="Times New Roman" w:eastAsia="Times New Roman" w:cs="Times New Roman"/>
+          <w:b w:val="0"/>
+          <w:bCs w:val="0"/>
+          <w:i w:val="0"/>
+          <w:iCs w:val="0"/>
+          <w:caps w:val="0"/>
+          <w:smallCaps w:val="0"/>
+          <w:noProof w:val="0"/>
+          <w:color w:val="000000" w:themeColor="text1" w:themeTint="FF" w:themeShade="FF"/>
+          <w:sz w:val="24"/>
+          <w:szCs w:val="24"/>
+          <w:lang w:val="en-US"/>
+        </w:rPr>
+      </w:pPr>
+      <w:r>
+        <w:rPr>
+          <w:rFonts w:ascii="Times New Roman" w:hAnsi="Times New Roman" w:eastAsia="Times New Roman" w:cs="Times New Roman" w:asciiTheme="minorAscii" w:hAnsiTheme="minorAscii" w:eastAsiaTheme="minorEastAsia" w:cstheme="minorBidi"/>
+          <w:b w:val="0"/>
+          <w:bCs w:val="0"/>
+          <w:i w:val="0"/>
+          <w:iCs w:val="0"/>
+          <w:caps w:val="0"/>
+          <w:smallCaps w:val="0"/>
+          <w:noProof w:val="0"/>
+          <w:color w:val="000000" w:themeColor="text1" w:themeTint="FF" w:themeShade="FF"/>
+          <w:sz w:val="24"/>
+          <w:szCs w:val="24"/>
+          <w:lang w:val="en-US" w:eastAsia="ja-JP" w:bidi="ar-SA"/>
         </w:rPr>
         <w:t xml:space="preserve">The TCP latency module measures application-level connectivity by evaluating DNS resolution and TCP connection establishment time. </w:t>
       </w:r>
       <w:r>
         <w:rPr>
-          <w:rFonts w:ascii="Times New Roman" w:hAnsi="Times New Roman" w:eastAsia="Times New Roman" w:cs="Times New Roman"/>
-          <w:b w:val="1"/>
-          <w:bCs w:val="1"/>
-          <w:noProof w:val="0"/>
-          <w:sz w:val="24"/>
-          <w:szCs w:val="24"/>
-          <w:lang w:val="en-US"/>
+          <w:rFonts w:ascii="Times New Roman" w:hAnsi="Times New Roman" w:eastAsia="Times New Roman" w:cs="Times New Roman" w:asciiTheme="minorAscii" w:hAnsiTheme="minorAscii" w:eastAsiaTheme="minorEastAsia" w:cstheme="minorBidi"/>
+          <w:b w:val="0"/>
+          <w:bCs w:val="0"/>
+          <w:i w:val="0"/>
+          <w:iCs w:val="0"/>
+          <w:caps w:val="0"/>
+          <w:smallCaps w:val="0"/>
+          <w:noProof w:val="0"/>
+          <w:color w:val="000000" w:themeColor="text1" w:themeTint="FF" w:themeShade="FF"/>
+          <w:sz w:val="24"/>
+          <w:szCs w:val="24"/>
+          <w:lang w:val="en-US" w:eastAsia="ja-JP" w:bidi="ar-SA"/>
         </w:rPr>
         <w:t xml:space="preserve">The hostname is first resolved into one or more IP addresses, and the time </w:t>
       </w:r>
       <w:r>
         <w:rPr>
-          <w:rFonts w:ascii="Times New Roman" w:hAnsi="Times New Roman" w:eastAsia="Times New Roman" w:cs="Times New Roman"/>
-          <w:b w:val="1"/>
-          <w:bCs w:val="1"/>
-          <w:noProof w:val="0"/>
-          <w:sz w:val="24"/>
-          <w:szCs w:val="24"/>
-          <w:lang w:val="en-US"/>
+          <w:rFonts w:ascii="Times New Roman" w:hAnsi="Times New Roman" w:eastAsia="Times New Roman" w:cs="Times New Roman" w:asciiTheme="minorAscii" w:hAnsiTheme="minorAscii" w:eastAsiaTheme="minorEastAsia" w:cstheme="minorBidi"/>
+          <w:b w:val="0"/>
+          <w:bCs w:val="0"/>
+          <w:i w:val="0"/>
+          <w:iCs w:val="0"/>
+          <w:caps w:val="0"/>
+          <w:smallCaps w:val="0"/>
+          <w:noProof w:val="0"/>
+          <w:color w:val="000000" w:themeColor="text1" w:themeTint="FF" w:themeShade="FF"/>
+          <w:sz w:val="24"/>
+          <w:szCs w:val="24"/>
+          <w:lang w:val="en-US" w:eastAsia="ja-JP" w:bidi="ar-SA"/>
         </w:rPr>
         <w:t>required</w:t>
       </w:r>
       <w:r>
         <w:rPr>
-          <w:rFonts w:ascii="Times New Roman" w:hAnsi="Times New Roman" w:eastAsia="Times New Roman" w:cs="Times New Roman"/>
-          <w:b w:val="1"/>
-          <w:bCs w:val="1"/>
-          <w:noProof w:val="0"/>
-          <w:sz w:val="24"/>
-          <w:szCs w:val="24"/>
-          <w:lang w:val="en-US"/>
+          <w:rFonts w:ascii="Times New Roman" w:hAnsi="Times New Roman" w:eastAsia="Times New Roman" w:cs="Times New Roman" w:asciiTheme="minorAscii" w:hAnsiTheme="minorAscii" w:eastAsiaTheme="minorEastAsia" w:cstheme="minorBidi"/>
+          <w:b w:val="0"/>
+          <w:bCs w:val="0"/>
+          <w:i w:val="0"/>
+          <w:iCs w:val="0"/>
+          <w:caps w:val="0"/>
+          <w:smallCaps w:val="0"/>
+          <w:noProof w:val="0"/>
+          <w:color w:val="000000" w:themeColor="text1" w:themeTint="FF" w:themeShade="FF"/>
+          <w:sz w:val="24"/>
+          <w:szCs w:val="24"/>
+          <w:lang w:val="en-US" w:eastAsia="ja-JP" w:bidi="ar-SA"/>
         </w:rPr>
         <w:t xml:space="preserve"> for this process is recorded as the DNS lookup time.</w:t>
       </w:r>
       <w:r>
         <w:rPr>
-          <w:rFonts w:ascii="Times New Roman" w:hAnsi="Times New Roman" w:eastAsia="Times New Roman" w:cs="Times New Roman"/>
-          <w:noProof w:val="0"/>
-          <w:sz w:val="24"/>
-          <w:szCs w:val="24"/>
-          <w:lang w:val="en-US"/>
+          <w:rFonts w:ascii="Times New Roman" w:hAnsi="Times New Roman" w:eastAsia="Times New Roman" w:cs="Times New Roman" w:asciiTheme="minorAscii" w:hAnsiTheme="minorAscii" w:eastAsiaTheme="minorEastAsia" w:cstheme="minorBidi"/>
+          <w:b w:val="0"/>
+          <w:bCs w:val="0"/>
+          <w:i w:val="0"/>
+          <w:iCs w:val="0"/>
+          <w:caps w:val="0"/>
+          <w:smallCaps w:val="0"/>
+          <w:noProof w:val="0"/>
+          <w:color w:val="000000" w:themeColor="text1" w:themeTint="FF" w:themeShade="FF"/>
+          <w:sz w:val="24"/>
+          <w:szCs w:val="24"/>
+          <w:lang w:val="en-US" w:eastAsia="ja-JP" w:bidi="ar-SA"/>
         </w:rPr>
         <w:t xml:space="preserve"> After DNS resolution is complete, a connection timer is started. The hostname is combined with the HTTPS port into a valid network address, and an attempt is made to </w:t>
       </w:r>
       <w:r>
         <w:rPr>
-          <w:rFonts w:ascii="Times New Roman" w:hAnsi="Times New Roman" w:eastAsia="Times New Roman" w:cs="Times New Roman"/>
-          <w:noProof w:val="0"/>
-          <w:sz w:val="24"/>
-          <w:szCs w:val="24"/>
-          <w:lang w:val="en-US"/>
+          <w:rFonts w:ascii="Times New Roman" w:hAnsi="Times New Roman" w:eastAsia="Times New Roman" w:cs="Times New Roman" w:asciiTheme="minorAscii" w:hAnsiTheme="minorAscii" w:eastAsiaTheme="minorEastAsia" w:cstheme="minorBidi"/>
+          <w:b w:val="0"/>
+          <w:bCs w:val="0"/>
+          <w:i w:val="0"/>
+          <w:iCs w:val="0"/>
+          <w:caps w:val="0"/>
+          <w:smallCaps w:val="0"/>
+          <w:noProof w:val="0"/>
+          <w:color w:val="000000" w:themeColor="text1" w:themeTint="FF" w:themeShade="FF"/>
+          <w:sz w:val="24"/>
+          <w:szCs w:val="24"/>
+          <w:lang w:val="en-US" w:eastAsia="ja-JP" w:bidi="ar-SA"/>
         </w:rPr>
         <w:t>establish</w:t>
       </w:r>
       <w:r>
         <w:rPr>
-          <w:rFonts w:ascii="Times New Roman" w:hAnsi="Times New Roman" w:eastAsia="Times New Roman" w:cs="Times New Roman"/>
-          <w:noProof w:val="0"/>
-          <w:sz w:val="24"/>
-          <w:szCs w:val="24"/>
-          <w:lang w:val="en-US"/>
+          <w:rFonts w:ascii="Times New Roman" w:hAnsi="Times New Roman" w:eastAsia="Times New Roman" w:cs="Times New Roman" w:asciiTheme="minorAscii" w:hAnsiTheme="minorAscii" w:eastAsiaTheme="minorEastAsia" w:cstheme="minorBidi"/>
+          <w:b w:val="0"/>
+          <w:bCs w:val="0"/>
+          <w:i w:val="0"/>
+          <w:iCs w:val="0"/>
+          <w:caps w:val="0"/>
+          <w:smallCaps w:val="0"/>
+          <w:noProof w:val="0"/>
+          <w:color w:val="000000" w:themeColor="text1" w:themeTint="FF" w:themeShade="FF"/>
+          <w:sz w:val="24"/>
+          <w:szCs w:val="24"/>
+          <w:lang w:val="en-US" w:eastAsia="ja-JP" w:bidi="ar-SA"/>
         </w:rPr>
         <w:t xml:space="preserve"> a TCP connection. </w:t>
       </w:r>
       <w:r>
         <w:rPr>
-          <w:rFonts w:ascii="Times New Roman" w:hAnsi="Times New Roman" w:eastAsia="Times New Roman" w:cs="Times New Roman"/>
-          <w:b w:val="1"/>
-          <w:bCs w:val="1"/>
-          <w:noProof w:val="0"/>
-          <w:sz w:val="24"/>
-          <w:szCs w:val="24"/>
-          <w:lang w:val="en-US"/>
+          <w:rFonts w:ascii="Times New Roman" w:hAnsi="Times New Roman" w:eastAsia="Times New Roman" w:cs="Times New Roman" w:asciiTheme="minorAscii" w:hAnsiTheme="minorAscii" w:eastAsiaTheme="minorEastAsia" w:cstheme="minorBidi"/>
+          <w:b w:val="0"/>
+          <w:bCs w:val="0"/>
+          <w:i w:val="0"/>
+          <w:iCs w:val="0"/>
+          <w:caps w:val="0"/>
+          <w:smallCaps w:val="0"/>
+          <w:noProof w:val="0"/>
+          <w:color w:val="000000" w:themeColor="text1" w:themeTint="FF" w:themeShade="FF"/>
+          <w:sz w:val="24"/>
+          <w:szCs w:val="24"/>
+          <w:lang w:val="en-US" w:eastAsia="ja-JP" w:bidi="ar-SA"/>
         </w:rPr>
         <w:t>After each attempt,</w:t>
       </w:r>
       <w:r>
         <w:rPr>
-          <w:rFonts w:ascii="Times New Roman" w:hAnsi="Times New Roman" w:eastAsia="Times New Roman" w:cs="Times New Roman"/>
-          <w:noProof w:val="0"/>
-          <w:sz w:val="24"/>
-          <w:szCs w:val="24"/>
-          <w:lang w:val="en-US"/>
+          <w:rFonts w:ascii="Times New Roman" w:hAnsi="Times New Roman" w:eastAsia="Times New Roman" w:cs="Times New Roman" w:asciiTheme="minorAscii" w:hAnsiTheme="minorAscii" w:eastAsiaTheme="minorEastAsia" w:cstheme="minorBidi"/>
+          <w:b w:val="0"/>
+          <w:bCs w:val="0"/>
+          <w:i w:val="0"/>
+          <w:iCs w:val="0"/>
+          <w:caps w:val="0"/>
+          <w:smallCaps w:val="0"/>
+          <w:noProof w:val="0"/>
+          <w:color w:val="000000" w:themeColor="text1" w:themeTint="FF" w:themeShade="FF"/>
+          <w:sz w:val="24"/>
+          <w:szCs w:val="24"/>
+          <w:lang w:val="en-US" w:eastAsia="ja-JP" w:bidi="ar-SA"/>
         </w:rPr>
         <w:t xml:space="preserve"> the elapsed connection time is recorded. This process is repeated three times, with the </w:t>
       </w:r>
       <w:r>
         <w:rPr>
-          <w:rFonts w:ascii="Times New Roman" w:hAnsi="Times New Roman" w:eastAsia="Times New Roman" w:cs="Times New Roman"/>
-          <w:b w:val="1"/>
-          <w:bCs w:val="1"/>
-          <w:noProof w:val="0"/>
-          <w:sz w:val="24"/>
-          <w:szCs w:val="24"/>
-          <w:lang w:val="en-US"/>
+          <w:rFonts w:ascii="Times New Roman" w:hAnsi="Times New Roman" w:eastAsia="Times New Roman" w:cs="Times New Roman" w:asciiTheme="minorAscii" w:hAnsiTheme="minorAscii" w:eastAsiaTheme="minorEastAsia" w:cstheme="minorBidi"/>
+          <w:b w:val="0"/>
+          <w:bCs w:val="0"/>
+          <w:i w:val="0"/>
+          <w:iCs w:val="0"/>
+          <w:caps w:val="0"/>
+          <w:smallCaps w:val="0"/>
+          <w:noProof w:val="0"/>
+          <w:color w:val="000000" w:themeColor="text1" w:themeTint="FF" w:themeShade="FF"/>
+          <w:sz w:val="24"/>
+          <w:szCs w:val="24"/>
+          <w:lang w:val="en-US" w:eastAsia="ja-JP" w:bidi="ar-SA"/>
         </w:rPr>
         <w:t>minimum and maximum connection times</w:t>
       </w:r>
       <w:r>
         <w:rPr>
-          <w:rFonts w:ascii="Times New Roman" w:hAnsi="Times New Roman" w:eastAsia="Times New Roman" w:cs="Times New Roman"/>
-          <w:noProof w:val="0"/>
-          <w:sz w:val="24"/>
-          <w:szCs w:val="24"/>
-          <w:lang w:val="en-US"/>
+          <w:rFonts w:ascii="Times New Roman" w:hAnsi="Times New Roman" w:eastAsia="Times New Roman" w:cs="Times New Roman" w:asciiTheme="minorAscii" w:hAnsiTheme="minorAscii" w:eastAsiaTheme="minorEastAsia" w:cstheme="minorBidi"/>
+          <w:b w:val="0"/>
+          <w:bCs w:val="0"/>
+          <w:i w:val="0"/>
+          <w:iCs w:val="0"/>
+          <w:caps w:val="0"/>
+          <w:smallCaps w:val="0"/>
+          <w:noProof w:val="0"/>
+          <w:color w:val="000000" w:themeColor="text1" w:themeTint="FF" w:themeShade="FF"/>
+          <w:sz w:val="24"/>
+          <w:szCs w:val="24"/>
+          <w:lang w:val="en-US" w:eastAsia="ja-JP" w:bidi="ar-SA"/>
         </w:rPr>
         <w:t xml:space="preserve"> being updated after each successful attempt. </w:t>
       </w:r>
       <w:r>
         <w:rPr>
-          <w:rFonts w:ascii="Times New Roman" w:hAnsi="Times New Roman" w:eastAsia="Times New Roman" w:cs="Times New Roman"/>
-          <w:b w:val="1"/>
-          <w:bCs w:val="1"/>
-          <w:noProof w:val="0"/>
-          <w:sz w:val="24"/>
-          <w:szCs w:val="24"/>
-          <w:lang w:val="en-US"/>
+          <w:rFonts w:ascii="Times New Roman" w:hAnsi="Times New Roman" w:eastAsia="Times New Roman" w:cs="Times New Roman" w:asciiTheme="minorAscii" w:hAnsiTheme="minorAscii" w:eastAsiaTheme="minorEastAsia" w:cstheme="minorBidi"/>
+          <w:b w:val="0"/>
+          <w:bCs w:val="0"/>
+          <w:i w:val="0"/>
+          <w:iCs w:val="0"/>
+          <w:caps w:val="0"/>
+          <w:smallCaps w:val="0"/>
+          <w:noProof w:val="0"/>
+          <w:color w:val="000000" w:themeColor="text1" w:themeTint="FF" w:themeShade="FF"/>
+          <w:sz w:val="24"/>
+          <w:szCs w:val="24"/>
+          <w:lang w:val="en-US" w:eastAsia="ja-JP" w:bidi="ar-SA"/>
         </w:rPr>
         <w:t>To compute the average connection time,</w:t>
       </w:r>
       <w:r>
         <w:rPr>
-          <w:rFonts w:ascii="Times New Roman" w:hAnsi="Times New Roman" w:eastAsia="Times New Roman" w:cs="Times New Roman"/>
-          <w:noProof w:val="0"/>
-          <w:sz w:val="24"/>
-          <w:szCs w:val="24"/>
-          <w:lang w:val="en-US"/>
+          <w:rFonts w:ascii="Times New Roman" w:hAnsi="Times New Roman" w:eastAsia="Times New Roman" w:cs="Times New Roman" w:asciiTheme="minorAscii" w:hAnsiTheme="minorAscii" w:eastAsiaTheme="minorEastAsia" w:cstheme="minorBidi"/>
+          <w:b w:val="0"/>
+          <w:bCs w:val="0"/>
+          <w:i w:val="0"/>
+          <w:iCs w:val="0"/>
+          <w:caps w:val="0"/>
+          <w:smallCaps w:val="0"/>
+          <w:noProof w:val="0"/>
+          <w:color w:val="000000" w:themeColor="text1" w:themeTint="FF" w:themeShade="FF"/>
+          <w:sz w:val="24"/>
+          <w:szCs w:val="24"/>
+          <w:lang w:val="en-US" w:eastAsia="ja-JP" w:bidi="ar-SA"/>
         </w:rPr>
         <w:t xml:space="preserve"> the elapsed time from successful connections </w:t>
       </w:r>
       <w:r>
         <w:rPr>
-          <w:rFonts w:ascii="Times New Roman" w:hAnsi="Times New Roman" w:eastAsia="Times New Roman" w:cs="Times New Roman"/>
-          <w:b w:val="1"/>
-          <w:bCs w:val="1"/>
-          <w:noProof w:val="0"/>
-          <w:sz w:val="24"/>
-          <w:szCs w:val="24"/>
-          <w:lang w:val="en-US"/>
+          <w:rFonts w:ascii="Times New Roman" w:hAnsi="Times New Roman" w:eastAsia="Times New Roman" w:cs="Times New Roman" w:asciiTheme="minorAscii" w:hAnsiTheme="minorAscii" w:eastAsiaTheme="minorEastAsia" w:cstheme="minorBidi"/>
+          <w:b w:val="0"/>
+          <w:bCs w:val="0"/>
+          <w:i w:val="0"/>
+          <w:iCs w:val="0"/>
+          <w:caps w:val="0"/>
+          <w:smallCaps w:val="0"/>
+          <w:noProof w:val="0"/>
+          <w:color w:val="000000" w:themeColor="text1" w:themeTint="FF" w:themeShade="FF"/>
+          <w:sz w:val="24"/>
+          <w:szCs w:val="24"/>
+          <w:lang w:val="en-US" w:eastAsia="ja-JP" w:bidi="ar-SA"/>
         </w:rPr>
         <w:t>is summed</w:t>
       </w:r>
       <w:r>
         <w:rPr>
-          <w:rFonts w:ascii="Times New Roman" w:hAnsi="Times New Roman" w:eastAsia="Times New Roman" w:cs="Times New Roman"/>
-          <w:noProof w:val="0"/>
-          <w:sz w:val="24"/>
-          <w:szCs w:val="24"/>
-          <w:lang w:val="en-US"/>
+          <w:rFonts w:ascii="Times New Roman" w:hAnsi="Times New Roman" w:eastAsia="Times New Roman" w:cs="Times New Roman" w:asciiTheme="minorAscii" w:hAnsiTheme="minorAscii" w:eastAsiaTheme="minorEastAsia" w:cstheme="minorBidi"/>
+          <w:b w:val="0"/>
+          <w:bCs w:val="0"/>
+          <w:i w:val="0"/>
+          <w:iCs w:val="0"/>
+          <w:caps w:val="0"/>
+          <w:smallCaps w:val="0"/>
+          <w:noProof w:val="0"/>
+          <w:color w:val="000000" w:themeColor="text1" w:themeTint="FF" w:themeShade="FF"/>
+          <w:sz w:val="24"/>
+          <w:szCs w:val="24"/>
+          <w:lang w:val="en-US" w:eastAsia="ja-JP" w:bidi="ar-SA"/>
         </w:rPr>
         <w:t xml:space="preserve"> and then divided by the number of successful connections. Packet loss is calculated by subtracting the number of successful connection attempts from the total number of connection attempts (three), </w:t>
       </w:r>
       <w:r>
         <w:rPr>
-          <w:rFonts w:ascii="Times New Roman" w:hAnsi="Times New Roman" w:eastAsia="Times New Roman" w:cs="Times New Roman"/>
-          <w:noProof w:val="0"/>
-          <w:sz w:val="24"/>
-          <w:szCs w:val="24"/>
-          <w:lang w:val="en-US"/>
+          <w:rFonts w:ascii="Times New Roman" w:hAnsi="Times New Roman" w:eastAsia="Times New Roman" w:cs="Times New Roman" w:asciiTheme="minorAscii" w:hAnsiTheme="minorAscii" w:eastAsiaTheme="minorEastAsia" w:cstheme="minorBidi"/>
+          <w:b w:val="0"/>
+          <w:bCs w:val="0"/>
+          <w:i w:val="0"/>
+          <w:iCs w:val="0"/>
+          <w:caps w:val="0"/>
+          <w:smallCaps w:val="0"/>
+          <w:noProof w:val="0"/>
+          <w:color w:val="000000" w:themeColor="text1" w:themeTint="FF" w:themeShade="FF"/>
+          <w:sz w:val="24"/>
+          <w:szCs w:val="24"/>
+          <w:lang w:val="en-US" w:eastAsia="ja-JP" w:bidi="ar-SA"/>
         </w:rPr>
         <w:t>dividing by</w:t>
       </w:r>
       <w:r>
         <w:rPr>
-          <w:rFonts w:ascii="Times New Roman" w:hAnsi="Times New Roman" w:eastAsia="Times New Roman" w:cs="Times New Roman"/>
-          <w:noProof w:val="0"/>
-          <w:sz w:val="24"/>
-          <w:szCs w:val="24"/>
-          <w:lang w:val="en-US"/>
+          <w:rFonts w:ascii="Times New Roman" w:hAnsi="Times New Roman" w:eastAsia="Times New Roman" w:cs="Times New Roman" w:asciiTheme="minorAscii" w:hAnsiTheme="minorAscii" w:eastAsiaTheme="minorEastAsia" w:cstheme="minorBidi"/>
+          <w:b w:val="0"/>
+          <w:bCs w:val="0"/>
+          <w:i w:val="0"/>
+          <w:iCs w:val="0"/>
+          <w:caps w:val="0"/>
+          <w:smallCaps w:val="0"/>
+          <w:noProof w:val="0"/>
+          <w:color w:val="000000" w:themeColor="text1" w:themeTint="FF" w:themeShade="FF"/>
+          <w:sz w:val="24"/>
+          <w:szCs w:val="24"/>
+          <w:lang w:val="en-US" w:eastAsia="ja-JP" w:bidi="ar-SA"/>
         </w:rPr>
         <w:t xml:space="preserve"> three, and then multiplying by 100 to produce a percentage.</w:t>
       </w:r>

</xml_diff>